<commit_message>
change to java 25 and start testing
</commit_message>
<xml_diff>
--- a/AI and Agents.docx
+++ b/AI and Agents.docx
@@ -22,15 +22,7 @@
         </w:rPr>
       </w:pPr>
       <w:r>
-        <w:t>We are building this backend API using Java with Spring Boot and PostgreSQL. Before writing any code, please carefully review all the requirements and constraints, then generate a detailed, step-by-step development plan. The plan must break down the project into logical, manageable phases (for example: Phase 1: Database Schema &amp; Entity Design, Phase 2: User Management &amp; Authentication, Phase 3: Core Tickets Logic, etc.), going item by item based on the document. Do not write or generate any implementation code yet. Only provide the structured plan so we can review and approve it first. /</w:t>
-      </w:r>
-      <w:proofErr w:type="gramStart"/>
-      <w:r>
-        <w:t>grill</w:t>
-      </w:r>
-      <w:proofErr w:type="gramEnd"/>
-      <w:r>
-        <w:t>-me</w:t>
+        <w:t>We are building this backend API using Java with Spring Boot and PostgreSQL. Before writing any code, please carefully review all the requirements and constraints, then generate a detailed, step-by-step development plan. The plan must break down the project into logical, manageable phases (for example: Phase 1: Database Schema &amp; Entity Design, Phase 2: User Management &amp; Authentication, Phase 3: Core Tickets Logic, etc.), going item by item based on the document. Do not write or generate any implementation code yet. Only provide the structured plan so we can review and approve it first. /grill-me</w:t>
       </w:r>
     </w:p>
     <w:p>
@@ -57,7 +49,6 @@
         <w:t xml:space="preserve">The plan is excellent and incredibly detailed. Let's start implementing. Please implement Phase 1 only: Project setup, update the pom.xml, configure </w:t>
       </w:r>
       <w:proofErr w:type="spellStart"/>
-      <w:proofErr w:type="gramStart"/>
       <w:r>
         <w:rPr>
           <w:b/>
@@ -66,7 +57,6 @@
         <w:t>application.yaml</w:t>
       </w:r>
       <w:proofErr w:type="spellEnd"/>
-      <w:proofErr w:type="gramEnd"/>
       <w:r>
         <w:rPr>
           <w:b/>
@@ -120,23 +110,7 @@
           <w:b/>
           <w:bCs/>
         </w:rPr>
-        <w:t xml:space="preserve">). Do not write code for any other features or </w:t>
-      </w:r>
-      <w:proofErr w:type="gramStart"/>
-      <w:r>
-        <w:rPr>
-          <w:b/>
-          <w:bCs/>
-        </w:rPr>
-        <w:t>phases</w:t>
-      </w:r>
-      <w:proofErr w:type="gramEnd"/>
-      <w:r>
-        <w:rPr>
-          <w:b/>
-          <w:bCs/>
-        </w:rPr>
-        <w:t xml:space="preserve"> yet.</w:t>
+        <w:t>). Do not write code for any other features or phases yet.</w:t>
       </w:r>
     </w:p>
     <w:p>
@@ -316,19 +290,7 @@
       </w:r>
       <w:proofErr w:type="spellEnd"/>
       <w:r>
-        <w:t xml:space="preserve"> exactly as specified in the plan. Pay close attention </w:t>
-      </w:r>
-      <w:proofErr w:type="gramStart"/>
-      <w:r>
-        <w:t>to:</w:t>
-      </w:r>
-      <w:proofErr w:type="gramEnd"/>
-      <w:r>
-        <w:t xml:space="preserve"> 1) Declaring the /tickets/deleted route BEFORE /</w:t>
-      </w:r>
-      <w:proofErr w:type="gramStart"/>
-      <w:r>
-        <w:t>tickets/{</w:t>
+        <w:t xml:space="preserve"> exactly as specified in the plan. Pay close attention to: 1) Declaring the /tickets/deleted route BEFORE /tickets/{</w:t>
       </w:r>
       <w:proofErr w:type="spellStart"/>
       <w:r>
@@ -336,11 +298,7 @@
       </w:r>
       <w:proofErr w:type="spellEnd"/>
       <w:r>
-        <w:t>},</w:t>
-      </w:r>
-      <w:proofErr w:type="gramEnd"/>
-      <w:r>
-        <w:t xml:space="preserve"> 2) Correctly computing the </w:t>
+        <w:t xml:space="preserve">}, 2) Correctly computing the </w:t>
       </w:r>
       <w:proofErr w:type="spellStart"/>
       <w:r>
@@ -408,15 +366,7 @@
         <w:jc w:val="right"/>
       </w:pPr>
       <w:r>
-        <w:t xml:space="preserve">Phase 3 is complete. Let's move to Phase 4 &amp; Phase 5: Users and Projects APIs. Please implement </w:t>
-      </w:r>
-      <w:proofErr w:type="gramStart"/>
-      <w:r>
-        <w:t>the complete</w:t>
-      </w:r>
-      <w:proofErr w:type="gramEnd"/>
-      <w:r>
-        <w:t xml:space="preserve"> controllers, services, repositories, and DTOs for both users and projects, including the soft-delete functionality for projects and the project workload endpoint exactly as specified in the plan. Show me the key files and where you are placing them. Do not write code for Phase 6 yet.</w:t>
+        <w:t>Phase 3 is complete. Let's move to Phase 4 &amp; Phase 5: Users and Projects APIs. Please implement the complete controllers, services, repositories, and DTOs for both users and projects, including the soft-delete functionality for projects and the project workload endpoint exactly as specified in the plan. Show me the key files and where you are placing them. Do not write code for Phase 6 yet.</w:t>
       </w:r>
     </w:p>
     <w:p>
@@ -457,23 +407,7 @@
       </w:r>
       <w:proofErr w:type="spellEnd"/>
       <w:r>
-        <w:t xml:space="preserve"> exactly as specified in the plan. Make sure it correctly applies the regex </w:t>
-      </w:r>
-      <w:proofErr w:type="gramStart"/>
-      <w:r>
-        <w:t>pattern @(</w:t>
-      </w:r>
-      <w:proofErr w:type="gramEnd"/>
-      <w:r>
-        <w:t>[a-zA-Z0-9</w:t>
-      </w:r>
-      <w:proofErr w:type="gramStart"/>
-      <w:r>
-        <w:t>_]+</w:t>
-      </w:r>
-      <w:proofErr w:type="gramEnd"/>
-      <w:r>
-        <w:t xml:space="preserve">) to extract usernames and save them to the </w:t>
+        <w:t xml:space="preserve"> exactly as specified in the plan. Make sure it correctly applies the regex pattern @([a-zA-Z0-9_]+) to extract usernames and save them to the </w:t>
       </w:r>
       <w:proofErr w:type="spellStart"/>
       <w:r>
@@ -506,23 +440,7 @@
           <w:b/>
           <w:bCs/>
         </w:rPr>
-        <w:t xml:space="preserve">Phase 7 is complete. Let's move to Phase 8: Audit Log (AOP-based). Please implement the </w:t>
-      </w:r>
-      <w:proofErr w:type="gramStart"/>
-      <w:r>
-        <w:rPr>
-          <w:b/>
-          <w:bCs/>
-        </w:rPr>
-        <w:t>custom @</w:t>
-      </w:r>
-      <w:proofErr w:type="gramEnd"/>
-      <w:r>
-        <w:rPr>
-          <w:b/>
-          <w:bCs/>
-        </w:rPr>
-        <w:t xml:space="preserve">Auditable annotation, the </w:t>
+        <w:t xml:space="preserve">Phase 7 is complete. Let's move to Phase 8: Audit Log (AOP-based). Please implement the custom @Auditable annotation, the </w:t>
       </w:r>
       <w:proofErr w:type="spellStart"/>
       <w:r>
@@ -776,10 +694,106 @@
     <w:p>
       <w:pPr>
         <w:jc w:val="right"/>
+      </w:pPr>
+      <w:r>
+        <w:rPr>
+          <w:b/>
+          <w:bCs/>
+        </w:rPr>
+        <w:t xml:space="preserve">Phase 11 is complete. Let's move to Phase 12: Auto-Escalation Background Job. Please enable scheduling in the application and implement the </w:t>
+      </w:r>
+      <w:proofErr w:type="spellStart"/>
+      <w:r>
+        <w:rPr>
+          <w:b/>
+          <w:bCs/>
+        </w:rPr>
+        <w:t>TicketEscalationScheduler</w:t>
+      </w:r>
+      <w:proofErr w:type="spellEnd"/>
+      <w:r>
+        <w:rPr>
+          <w:b/>
+          <w:bCs/>
+        </w:rPr>
+        <w:t xml:space="preserve"> exactly as specified in the plan. The scheduler should run every 5 minutes, scan for active, un-deleted, un-closed tickets whose due dates have passed, and escalate their priority by one level. Ensure that these mutations trigger the Audit Log with 'SYSTEM' as the actor. Show me the key files and where you are placing them. Do not write code for Phase 13 yet.</w:t>
+      </w:r>
+    </w:p>
+    <w:p>
+      <w:pPr>
+        <w:jc w:val="right"/>
+      </w:pPr>
+      <w:r>
+        <w:t xml:space="preserve">To verify the integrity of Phase 13, please show me the exact code for the following 3 specific test methods you implemented: 1. The test method in </w:t>
+      </w:r>
+      <w:proofErr w:type="spellStart"/>
+      <w:r>
+        <w:t>DependencyServiceTest</w:t>
+      </w:r>
+      <w:proofErr w:type="spellEnd"/>
+      <w:r>
+        <w:t xml:space="preserve"> that validates circular dependency prevention (the DFS failure case). 2. The test method in </w:t>
+      </w:r>
+      <w:proofErr w:type="spellStart"/>
+      <w:r>
+        <w:t>AutoAssignmentServiceTest</w:t>
+      </w:r>
+      <w:proofErr w:type="spellEnd"/>
+      <w:r>
+        <w:t xml:space="preserve"> that validates tie-breaking logic (choosing the developer with the lowest ID when ticket counts are equal). 3. The test method in </w:t>
+      </w:r>
+      <w:proofErr w:type="spellStart"/>
+      <w:r>
+        <w:t>ProjectServiceTest</w:t>
+      </w:r>
+      <w:proofErr w:type="spellEnd"/>
+      <w:r>
+        <w:t xml:space="preserve"> that validates soft-delete filtering (ensuring deleted projects are excluded from regular active lists). Show only these specific methods so I can inspect their logic.</w:t>
+      </w:r>
+    </w:p>
+    <w:p>
+      <w:pPr>
+        <w:jc w:val="right"/>
+      </w:pPr>
+    </w:p>
+    <w:p>
+      <w:pPr>
+        <w:jc w:val="right"/>
         <w:rPr>
           <w:rFonts w:hint="cs"/>
         </w:rPr>
       </w:pPr>
+      <w:r>
+        <w:t xml:space="preserve">The test code looks exceptional and perfectly validates our core edge cases. Let's move to the final stage — Phase 14: Documentation &amp; </w:t>
+      </w:r>
+      <w:proofErr w:type="spellStart"/>
+      <w:r>
+        <w:t>OpenAPI</w:t>
+      </w:r>
+      <w:proofErr w:type="spellEnd"/>
+      <w:r>
+        <w:t xml:space="preserve">/Swagger. Please integrate </w:t>
+      </w:r>
+      <w:proofErr w:type="spellStart"/>
+      <w:r>
+        <w:t>Springdoc</w:t>
+      </w:r>
+      <w:proofErr w:type="spellEnd"/>
+      <w:r>
+        <w:t xml:space="preserve"> </w:t>
+      </w:r>
+      <w:proofErr w:type="spellStart"/>
+      <w:r>
+        <w:t>OpenAPI</w:t>
+      </w:r>
+      <w:proofErr w:type="spellEnd"/>
+      <w:r>
+        <w:t xml:space="preserve"> (Swagger UI) into the project as specified in the plan, configure the local manual testing instructions, and generate the final </w:t>
+      </w:r>
+      <w:r>
+        <w:lastRenderedPageBreak/>
+        <w:t>comprehensive README.md layout. Show me the Swagger configuration file and where it is located. Do not write any new feature code beyond this.</w:t>
+      </w:r>
     </w:p>
     <w:sectPr>
       <w:pgSz w:w="11906" w:h="16838"/>

</xml_diff>